<commit_message>
admin panel qoshldi va qolgan funksiyalr ham ishlab turbti va hozrda admin panel ustida ish olb boryapman
</commit_message>
<xml_diff>
--- a/temp/test_obyektivka.docx
+++ b/temp/test_obyektivka.docx
@@ -74,7 +74,7 @@
                 <w:sz w:val="34"/>
                 <w:spacing w:val="10"/>
               </w:rPr>
-              <w:t>PALONCHIYEV PISTONCHI G'ISHMATOVICH</w:t>
+              <w:t>TEST</w:t>
             </w:r>
           </w:p>
         </w:tc>
@@ -133,8 +133,8 @@
           </w:tcPr>
           <w:p>
             <w:pPr>
-              <w:spacing w:before="80" w:after="20"/>
-              <w:ind w:left="113" w:right="113"/>
+              <w:spacing w:before="200" w:after="40"/>
+              <w:ind w:left="0" w:right="227"/>
             </w:pPr>
             <w:r>
               <w:rPr>
@@ -150,8 +150,8 @@
           </w:p>
           <w:p>
             <w:pPr>
-              <w:spacing w:before="20" w:after="120"/>
-              <w:ind w:left="113" w:right="113"/>
+              <w:spacing w:before="40" w:after="200"/>
+              <w:ind w:left="0" w:right="227"/>
             </w:pPr>
             <w:r>
               <w:rPr>
@@ -161,7 +161,6 @@
                 <w:color w:val="000000"/>
                 <w:sz w:val="24"/>
               </w:rPr>
-              <w:t>01.01.1990</w:t>
             </w:r>
           </w:p>
         </w:tc>
@@ -175,8 +174,8 @@
           </w:tcPr>
           <w:p>
             <w:pPr>
-              <w:spacing w:before="80" w:after="20"/>
-              <w:ind w:left="113" w:right="113"/>
+              <w:spacing w:before="200" w:after="40"/>
+              <w:ind w:left="0" w:right="227"/>
             </w:pPr>
             <w:r>
               <w:rPr>
@@ -192,8 +191,8 @@
           </w:p>
           <w:p>
             <w:pPr>
-              <w:spacing w:before="20" w:after="120"/>
-              <w:ind w:left="113" w:right="113"/>
+              <w:spacing w:before="40" w:after="200"/>
+              <w:ind w:left="0" w:right="227"/>
             </w:pPr>
             <w:r>
               <w:rPr>
@@ -203,7 +202,6 @@
                 <w:color w:val="000000"/>
                 <w:sz w:val="24"/>
               </w:rPr>
-              <w:t>Toshkent shahar</w:t>
             </w:r>
           </w:p>
         </w:tc>
@@ -219,8 +217,8 @@
           </w:tcPr>
           <w:p>
             <w:pPr>
-              <w:spacing w:before="80" w:after="20"/>
-              <w:ind w:left="113" w:right="113"/>
+              <w:spacing w:before="200" w:after="40"/>
+              <w:ind w:left="0" w:right="227"/>
             </w:pPr>
             <w:r>
               <w:rPr>
@@ -236,8 +234,8 @@
           </w:p>
           <w:p>
             <w:pPr>
-              <w:spacing w:before="20" w:after="120"/>
-              <w:ind w:left="113" w:right="113"/>
+              <w:spacing w:before="40" w:after="200"/>
+              <w:ind w:left="0" w:right="227"/>
             </w:pPr>
             <w:r>
               <w:rPr>
@@ -247,7 +245,6 @@
                 <w:color w:val="000000"/>
                 <w:sz w:val="24"/>
               </w:rPr>
-              <w:t>O'zbek</w:t>
             </w:r>
           </w:p>
         </w:tc>
@@ -261,8 +258,8 @@
           </w:tcPr>
           <w:p>
             <w:pPr>
-              <w:spacing w:before="80" w:after="20"/>
-              <w:ind w:left="113" w:right="113"/>
+              <w:spacing w:before="200" w:after="40"/>
+              <w:ind w:left="0" w:right="227"/>
             </w:pPr>
             <w:r>
               <w:rPr>
@@ -278,8 +275,8 @@
           </w:p>
           <w:p>
             <w:pPr>
-              <w:spacing w:before="20" w:after="120"/>
-              <w:ind w:left="113" w:right="113"/>
+              <w:spacing w:before="40" w:after="200"/>
+              <w:ind w:left="0" w:right="227"/>
             </w:pPr>
             <w:r>
               <w:rPr>
@@ -289,7 +286,6 @@
                 <w:color w:val="000000"/>
                 <w:sz w:val="24"/>
               </w:rPr>
-              <w:t>Yo'q</w:t>
             </w:r>
           </w:p>
         </w:tc>
@@ -305,8 +301,8 @@
           </w:tcPr>
           <w:p>
             <w:pPr>
-              <w:spacing w:before="80" w:after="20"/>
-              <w:ind w:left="113" w:right="113"/>
+              <w:spacing w:before="200" w:after="40"/>
+              <w:ind w:left="0" w:right="227"/>
             </w:pPr>
             <w:r>
               <w:rPr>
@@ -322,8 +318,8 @@
           </w:p>
           <w:p>
             <w:pPr>
-              <w:spacing w:before="20" w:after="120"/>
-              <w:ind w:left="113" w:right="113"/>
+              <w:spacing w:before="40" w:after="200"/>
+              <w:ind w:left="0" w:right="227"/>
             </w:pPr>
             <w:r>
               <w:rPr>
@@ -333,7 +329,6 @@
                 <w:color w:val="000000"/>
                 <w:sz w:val="24"/>
               </w:rPr>
-              <w:t>Oliy</w:t>
             </w:r>
           </w:p>
         </w:tc>
@@ -347,8 +342,8 @@
           </w:tcPr>
           <w:p>
             <w:pPr>
-              <w:spacing w:before="80" w:after="20"/>
-              <w:ind w:left="113" w:right="113"/>
+              <w:spacing w:before="200" w:after="40"/>
+              <w:ind w:left="0" w:right="227"/>
             </w:pPr>
             <w:r>
               <w:rPr>
@@ -364,8 +359,8 @@
           </w:p>
           <w:p>
             <w:pPr>
-              <w:spacing w:before="20" w:after="120"/>
-              <w:ind w:left="113" w:right="113"/>
+              <w:spacing w:before="40" w:after="200"/>
+              <w:ind w:left="0" w:right="227"/>
             </w:pPr>
             <w:r>
               <w:rPr>
@@ -375,7 +370,6 @@
                 <w:color w:val="000000"/>
                 <w:sz w:val="24"/>
               </w:rPr>
-              <w:t>2012 y. Toshkent Axborot Texnologiyalari Universiteti</w:t>
             </w:r>
           </w:p>
         </w:tc>
@@ -391,8 +385,8 @@
           </w:tcPr>
           <w:p>
             <w:pPr>
-              <w:spacing w:before="80" w:after="20"/>
-              <w:ind w:left="113" w:right="113"/>
+              <w:spacing w:before="200" w:after="40"/>
+              <w:ind w:left="0" w:right="227"/>
             </w:pPr>
             <w:r>
               <w:rPr>
@@ -408,8 +402,8 @@
           </w:p>
           <w:p>
             <w:pPr>
-              <w:spacing w:before="20" w:after="120"/>
-              <w:ind w:left="113" w:right="113"/>
+              <w:spacing w:before="40" w:after="200"/>
+              <w:ind w:left="0" w:right="227"/>
             </w:pPr>
             <w:r>
               <w:rPr>
@@ -419,7 +413,6 @@
                 <w:color w:val="000000"/>
                 <w:sz w:val="24"/>
               </w:rPr>
-              <w:t>Dasturchi</w:t>
             </w:r>
           </w:p>
         </w:tc>
@@ -433,8 +426,8 @@
           </w:tcPr>
           <w:p>
             <w:pPr>
-              <w:spacing w:before="80" w:after="20"/>
-              <w:ind w:left="113" w:right="113"/>
+              <w:spacing w:before="200" w:after="40"/>
+              <w:ind w:left="0" w:right="227"/>
             </w:pPr>
             <w:r>
               <w:rPr>
@@ -450,8 +443,8 @@
           </w:p>
           <w:p>
             <w:pPr>
-              <w:spacing w:before="20" w:after="120"/>
-              <w:ind w:left="113" w:right="113"/>
+              <w:spacing w:before="40" w:after="200"/>
+              <w:ind w:left="0" w:right="227"/>
             </w:pPr>
             <w:r>
               <w:rPr>
@@ -461,7 +454,6 @@
                 <w:color w:val="000000"/>
                 <w:sz w:val="24"/>
               </w:rPr>
-              <w:t>Yo'q</w:t>
             </w:r>
           </w:p>
         </w:tc>
@@ -477,8 +469,8 @@
           </w:tcPr>
           <w:p>
             <w:pPr>
-              <w:spacing w:before="80" w:after="20"/>
-              <w:ind w:left="113" w:right="113"/>
+              <w:spacing w:before="200" w:after="40"/>
+              <w:ind w:left="0" w:right="227"/>
             </w:pPr>
             <w:r>
               <w:rPr>
@@ -494,8 +486,8 @@
           </w:p>
           <w:p>
             <w:pPr>
-              <w:spacing w:before="20" w:after="120"/>
-              <w:ind w:left="113" w:right="113"/>
+              <w:spacing w:before="40" w:after="200"/>
+              <w:ind w:left="0" w:right="227"/>
             </w:pPr>
             <w:r>
               <w:rPr>
@@ -505,7 +497,6 @@
                 <w:color w:val="000000"/>
                 <w:sz w:val="24"/>
               </w:rPr>
-              <w:t>Yo'q</w:t>
             </w:r>
           </w:p>
         </w:tc>
@@ -519,8 +510,8 @@
           </w:tcPr>
           <w:p>
             <w:pPr>
-              <w:spacing w:before="80" w:after="20"/>
-              <w:ind w:left="113" w:right="113"/>
+              <w:spacing w:before="200" w:after="40"/>
+              <w:ind w:left="0" w:right="227"/>
             </w:pPr>
             <w:r>
               <w:rPr>
@@ -536,8 +527,8 @@
           </w:p>
           <w:p>
             <w:pPr>
-              <w:spacing w:before="20" w:after="120"/>
-              <w:ind w:left="113" w:right="113"/>
+              <w:spacing w:before="40" w:after="200"/>
+              <w:ind w:left="0" w:right="227"/>
             </w:pPr>
             <w:r>
               <w:rPr>
@@ -547,7 +538,6 @@
                 <w:color w:val="000000"/>
                 <w:sz w:val="24"/>
               </w:rPr>
-              <w:t>Rus, Ingliz</w:t>
             </w:r>
           </w:p>
         </w:tc>
@@ -563,8 +553,8 @@
           </w:tcPr>
           <w:p>
             <w:pPr>
-              <w:spacing w:before="80" w:after="20"/>
-              <w:ind w:left="113" w:right="113"/>
+              <w:spacing w:before="200" w:after="40"/>
+              <w:ind w:left="0" w:right="227"/>
             </w:pPr>
             <w:r>
               <w:rPr>
@@ -580,8 +570,8 @@
           </w:p>
           <w:p>
             <w:pPr>
-              <w:spacing w:before="20" w:after="120"/>
-              <w:ind w:left="113" w:right="113"/>
+              <w:spacing w:before="40" w:after="200"/>
+              <w:ind w:left="0" w:right="227"/>
             </w:pPr>
             <w:r>
               <w:rPr>
@@ -591,7 +581,6 @@
                 <w:color w:val="000000"/>
                 <w:sz w:val="24"/>
               </w:rPr>
-              <w:t>Yo'q</w:t>
             </w:r>
           </w:p>
         </w:tc>
@@ -605,8 +594,8 @@
           </w:tcPr>
           <w:p>
             <w:pPr>
-              <w:spacing w:before="80" w:after="20"/>
-              <w:ind w:left="113" w:right="113"/>
+              <w:spacing w:before="200" w:after="40"/>
+              <w:ind w:left="0" w:right="227"/>
             </w:pPr>
             <w:r>
               <w:rPr>
@@ -622,8 +611,8 @@
           </w:p>
           <w:p>
             <w:pPr>
-              <w:spacing w:before="20" w:after="120"/>
-              <w:ind w:left="113" w:right="113"/>
+              <w:spacing w:before="40" w:after="200"/>
+              <w:ind w:left="0" w:right="227"/>
             </w:pPr>
             <w:r>
               <w:rPr>
@@ -633,7 +622,6 @@
                 <w:color w:val="000000"/>
                 <w:sz w:val="24"/>
               </w:rPr>
-              <w:t>Yo'q</w:t>
             </w:r>
           </w:p>
         </w:tc>
@@ -660,184 +648,21 @@
         <w:t>MEHNAT FAOLIYATI</w:t>
       </w:r>
     </w:p>
-    <w:tbl>
-      <w:tblPr>
-        <w:tblW w:type="auto" w:w="0"/>
-        <w:tblLook w:firstColumn="1" w:firstRow="1" w:lastColumn="0" w:lastRow="0" w:noHBand="0" w:noVBand="1" w:val="04A0"/>
-        <w:tblBorders>
-          <w:top w:val="none" w:sz="0" w:space="0" w:color="auto"/>
-          <w:left w:val="none" w:sz="0" w:space="0" w:color="auto"/>
-          <w:bottom w:val="none" w:sz="0" w:space="0" w:color="auto"/>
-          <w:right w:val="none" w:sz="0" w:space="0" w:color="auto"/>
-          <w:insideH w:val="none" w:sz="0" w:space="0" w:color="auto"/>
-          <w:insideV w:val="none" w:sz="0" w:space="0" w:color="auto"/>
-        </w:tblBorders>
-      </w:tblPr>
-      <w:tblGrid>
-        <w:gridCol w:w="4932"/>
-        <w:gridCol w:w="4932"/>
-      </w:tblGrid>
-      <w:tr>
-        <w:tc>
-          <w:tcPr>
-            <w:tcW w:type="dxa" w:w="1628711"/>
-            <w:shd w:val="clear" w:color="auto" w:fill="FFFFFF"/>
-            <w:tcBorders>
-              <w:top w:val="single" w:sz="12" w:space="0" w:color="000000"/>
-              <w:bottom w:val="single" w:sz="12" w:space="0" w:color="000000"/>
-            </w:tcBorders>
-          </w:tcPr>
-          <w:p>
-            <w:pPr>
-              <w:jc w:val="center"/>
-              <w:spacing w:before="80" w:after="80"/>
-            </w:pPr>
-            <w:r>
-              <w:rPr>
-                <w:rFonts w:ascii="Times New Roman" w:hAnsi="Times New Roman"/>
-                <w:b/>
-                <w:i w:val="0"/>
-                <w:color w:val="000000"/>
-                <w:sz w:val="22"/>
-                <w:spacing w:val="10"/>
-              </w:rPr>
-              <w:t>Yillar</w:t>
-            </w:r>
-          </w:p>
-        </w:tc>
-        <w:tc>
-          <w:tcPr>
-            <w:tcW w:type="dxa" w:w="4635563"/>
-            <w:shd w:val="clear" w:color="auto" w:fill="FFFFFF"/>
-            <w:tcBorders>
-              <w:top w:val="single" w:sz="12" w:space="0" w:color="000000"/>
-              <w:bottom w:val="single" w:sz="12" w:space="0" w:color="000000"/>
-            </w:tcBorders>
-          </w:tcPr>
-          <w:p>
-            <w:pPr>
-              <w:jc w:val="center"/>
-              <w:spacing w:before="80" w:after="80"/>
-            </w:pPr>
-            <w:r>
-              <w:rPr>
-                <w:rFonts w:ascii="Times New Roman" w:hAnsi="Times New Roman"/>
-                <w:b/>
-                <w:i w:val="0"/>
-                <w:color w:val="000000"/>
-                <w:sz w:val="22"/>
-                <w:spacing w:val="10"/>
-              </w:rPr>
-              <w:t>Ish joyi va lavozimi</w:t>
-            </w:r>
-          </w:p>
-        </w:tc>
-      </w:tr>
-      <w:tr>
-        <w:tc>
-          <w:tcPr>
-            <w:tcW w:type="dxa" w:w="1628711"/>
-            <w:shd w:val="clear" w:color="auto" w:fill="FFFFFF"/>
-            <w:tcBorders>
-              <w:bottom w:val="single" w:sz="4" w:space="0" w:color="CCCCCC"/>
-            </w:tcBorders>
-          </w:tcPr>
-          <w:p>
-            <w:pPr>
-              <w:spacing w:before="100" w:after="100"/>
-              <w:ind w:left="113"/>
-            </w:pPr>
-            <w:r>
-              <w:rPr>
-                <w:rFonts w:ascii="Times New Roman" w:hAnsi="Times New Roman"/>
-                <w:b/>
-                <w:i w:val="0"/>
-                <w:color w:val="000000"/>
-                <w:sz w:val="23"/>
-              </w:rPr>
-              <w:t>2012-2015</w:t>
-            </w:r>
-          </w:p>
-        </w:tc>
-        <w:tc>
-          <w:tcPr>
-            <w:tcW w:type="dxa" w:w="4635563"/>
-            <w:shd w:val="clear" w:color="auto" w:fill="FFFFFF"/>
-            <w:tcBorders>
-              <w:bottom w:val="single" w:sz="4" w:space="0" w:color="CCCCCC"/>
-            </w:tcBorders>
-          </w:tcPr>
-          <w:p>
-            <w:pPr>
-              <w:spacing w:before="100" w:after="100"/>
-              <w:ind w:left="113"/>
-            </w:pPr>
-            <w:r>
-              <w:rPr>
-                <w:rFonts w:ascii="Times New Roman" w:hAnsi="Times New Roman"/>
-                <w:b w:val="0"/>
-                <w:i w:val="0"/>
-                <w:color w:val="000000"/>
-                <w:sz w:val="23"/>
-              </w:rPr>
-              <w:t>Toshkent shahar hokimiyati dasturchisi</w:t>
-            </w:r>
-          </w:p>
-        </w:tc>
-      </w:tr>
-      <w:tr>
-        <w:tc>
-          <w:tcPr>
-            <w:tcW w:type="dxa" w:w="1628711"/>
-            <w:shd w:val="clear" w:color="auto" w:fill="FFFFFF"/>
-            <w:tcBorders>
-              <w:bottom w:val="single" w:sz="4" w:space="0" w:color="CCCCCC"/>
-            </w:tcBorders>
-          </w:tcPr>
-          <w:p>
-            <w:pPr>
-              <w:spacing w:before="100" w:after="100"/>
-              <w:ind w:left="113"/>
-            </w:pPr>
-            <w:r>
-              <w:rPr>
-                <w:rFonts w:ascii="Times New Roman" w:hAnsi="Times New Roman"/>
-                <w:b/>
-                <w:i w:val="0"/>
-                <w:color w:val="000000"/>
-                <w:sz w:val="23"/>
-              </w:rPr>
-              <w:t>2015-h.v.</w:t>
-            </w:r>
-          </w:p>
-        </w:tc>
-        <w:tc>
-          <w:tcPr>
-            <w:tcW w:type="dxa" w:w="4635563"/>
-            <w:shd w:val="clear" w:color="auto" w:fill="FFFFFF"/>
-            <w:tcBorders>
-              <w:bottom w:val="single" w:sz="4" w:space="0" w:color="CCCCCC"/>
-            </w:tcBorders>
-          </w:tcPr>
-          <w:p>
-            <w:pPr>
-              <w:spacing w:before="100" w:after="100"/>
-              <w:ind w:left="113"/>
-            </w:pPr>
-            <w:r>
-              <w:rPr>
-                <w:rFonts w:ascii="Times New Roman" w:hAnsi="Times New Roman"/>
-                <w:b w:val="0"/>
-                <w:i w:val="0"/>
-                <w:color w:val="000000"/>
-                <w:sz w:val="23"/>
-              </w:rPr>
-              <w:t>Google dasturchisi</w:t>
-            </w:r>
-          </w:p>
-        </w:tc>
-      </w:tr>
-    </w:tbl>
+    <w:p>
+      <w:pPr>
+        <w:jc w:val="center"/>
+      </w:pPr>
+      <w:r>
+        <w:rPr>
+          <w:rFonts w:ascii="Times New Roman" w:hAnsi="Times New Roman"/>
+          <w:b w:val="0"/>
+          <w:i/>
+          <w:color w:val="000000"/>
+          <w:sz w:val="19"/>
+        </w:rPr>
+        <w:t>—</w:t>
+      </w:r>
+    </w:p>
     <w:p/>
     <w:p>
       <w:pPr>
@@ -856,314 +681,24 @@
           <w:sz w:val="28"/>
           <w:spacing w:val="60"/>
         </w:rPr>
-        <w:t>PALONCHIYEV YAQIN QARINDOSHLARI HAQIDA MA'LUMOT</w:t>
+        <w:t>TEST YAQIN QARINDOSHLARI HAQIDA MA'LUMOT</w:t>
       </w:r>
     </w:p>
-    <w:tbl>
-      <w:tblPr>
-        <w:tblW w:type="auto" w:w="0"/>
-        <w:tblLook w:firstColumn="1" w:firstRow="1" w:lastColumn="0" w:lastRow="0" w:noHBand="0" w:noVBand="1" w:val="04A0"/>
-        <w:tblBorders>
-          <w:top w:val="none" w:sz="0" w:space="0" w:color="auto"/>
-          <w:left w:val="none" w:sz="0" w:space="0" w:color="auto"/>
-          <w:bottom w:val="none" w:sz="0" w:space="0" w:color="auto"/>
-          <w:right w:val="none" w:sz="0" w:space="0" w:color="auto"/>
-          <w:insideH w:val="none" w:sz="0" w:space="0" w:color="auto"/>
-          <w:insideV w:val="none" w:sz="0" w:space="0" w:color="auto"/>
-        </w:tblBorders>
-      </w:tblPr>
-      <w:tblGrid>
-        <w:gridCol w:w="1973"/>
-        <w:gridCol w:w="1973"/>
-        <w:gridCol w:w="1973"/>
-        <w:gridCol w:w="1973"/>
-        <w:gridCol w:w="1973"/>
-      </w:tblGrid>
-      <w:tr>
-        <w:tc>
-          <w:tcPr>
-            <w:tcW w:type="dxa" w:w="814355"/>
-            <w:shd w:val="clear" w:color="auto" w:fill="EFEFEF"/>
-            <w:tcBorders>
-              <w:top w:val="single" w:sz="4" w:space="0" w:color="000000"/>
-              <w:bottom w:val="single" w:sz="4" w:space="0" w:color="000000"/>
-              <w:left w:val="single" w:sz="4" w:space="0" w:color="000000"/>
-              <w:right w:val="single" w:sz="4" w:space="0" w:color="000000"/>
-            </w:tcBorders>
-          </w:tcPr>
-          <w:p>
-            <w:pPr>
-              <w:jc w:val="center"/>
-              <w:spacing w:before="80" w:after="80"/>
-            </w:pPr>
-            <w:r>
-              <w:rPr>
-                <w:rFonts w:ascii="Times New Roman" w:hAnsi="Times New Roman"/>
-                <w:b/>
-                <w:i w:val="0"/>
-                <w:color w:val="000000"/>
-                <w:sz w:val="20"/>
-              </w:rPr>
-              <w:t>Qarindoshligi</w:t>
-            </w:r>
-          </w:p>
-        </w:tc>
-        <w:tc>
-          <w:tcPr>
-            <w:tcW w:type="dxa" w:w="1252855"/>
-            <w:shd w:val="clear" w:color="auto" w:fill="EFEFEF"/>
-            <w:tcBorders>
-              <w:top w:val="single" w:sz="4" w:space="0" w:color="000000"/>
-              <w:bottom w:val="single" w:sz="4" w:space="0" w:color="000000"/>
-              <w:left w:val="single" w:sz="4" w:space="0" w:color="000000"/>
-              <w:right w:val="single" w:sz="4" w:space="0" w:color="000000"/>
-            </w:tcBorders>
-          </w:tcPr>
-          <w:p>
-            <w:pPr>
-              <w:jc w:val="center"/>
-              <w:spacing w:before="80" w:after="80"/>
-            </w:pPr>
-            <w:r>
-              <w:rPr>
-                <w:rFonts w:ascii="Times New Roman" w:hAnsi="Times New Roman"/>
-                <w:b/>
-                <w:i w:val="0"/>
-                <w:color w:val="000000"/>
-                <w:sz w:val="20"/>
-              </w:rPr>
-              <w:t>F.I.SH.</w:t>
-            </w:r>
-          </w:p>
-        </w:tc>
-        <w:tc>
-          <w:tcPr>
-            <w:tcW w:type="dxa" w:w="1064926"/>
-            <w:shd w:val="clear" w:color="auto" w:fill="EFEFEF"/>
-            <w:tcBorders>
-              <w:top w:val="single" w:sz="4" w:space="0" w:color="000000"/>
-              <w:bottom w:val="single" w:sz="4" w:space="0" w:color="000000"/>
-              <w:left w:val="single" w:sz="4" w:space="0" w:color="000000"/>
-              <w:right w:val="single" w:sz="4" w:space="0" w:color="000000"/>
-            </w:tcBorders>
-          </w:tcPr>
-          <w:p>
-            <w:pPr>
-              <w:jc w:val="center"/>
-              <w:spacing w:before="80" w:after="80"/>
-            </w:pPr>
-            <w:r>
-              <w:rPr>
-                <w:rFonts w:ascii="Times New Roman" w:hAnsi="Times New Roman"/>
-                <w:b/>
-                <w:i w:val="0"/>
-                <w:color w:val="000000"/>
-                <w:sz w:val="20"/>
-              </w:rPr>
-              <w:t>Tug'ilgan yili va joyi</w:t>
-            </w:r>
-          </w:p>
-        </w:tc>
-        <w:tc>
-          <w:tcPr>
-            <w:tcW w:type="dxa" w:w="1753997"/>
-            <w:shd w:val="clear" w:color="auto" w:fill="EFEFEF"/>
-            <w:tcBorders>
-              <w:top w:val="single" w:sz="4" w:space="0" w:color="000000"/>
-              <w:bottom w:val="single" w:sz="4" w:space="0" w:color="000000"/>
-              <w:left w:val="single" w:sz="4" w:space="0" w:color="000000"/>
-              <w:right w:val="single" w:sz="4" w:space="0" w:color="000000"/>
-            </w:tcBorders>
-          </w:tcPr>
-          <w:p>
-            <w:pPr>
-              <w:jc w:val="center"/>
-              <w:spacing w:before="80" w:after="80"/>
-            </w:pPr>
-            <w:r>
-              <w:rPr>
-                <w:rFonts w:ascii="Times New Roman" w:hAnsi="Times New Roman"/>
-                <w:b/>
-                <w:i w:val="0"/>
-                <w:color w:val="000000"/>
-                <w:sz w:val="20"/>
-              </w:rPr>
-              <w:t>Ish joyi va lavozimi</w:t>
-            </w:r>
-          </w:p>
-        </w:tc>
-        <w:tc>
-          <w:tcPr>
-            <w:tcW w:type="dxa" w:w="1378140"/>
-            <w:shd w:val="clear" w:color="auto" w:fill="EFEFEF"/>
-            <w:tcBorders>
-              <w:top w:val="single" w:sz="4" w:space="0" w:color="000000"/>
-              <w:bottom w:val="single" w:sz="4" w:space="0" w:color="000000"/>
-              <w:left w:val="single" w:sz="4" w:space="0" w:color="000000"/>
-              <w:right w:val="single" w:sz="4" w:space="0" w:color="000000"/>
-            </w:tcBorders>
-          </w:tcPr>
-          <w:p>
-            <w:pPr>
-              <w:jc w:val="center"/>
-              <w:spacing w:before="80" w:after="80"/>
-            </w:pPr>
-            <w:r>
-              <w:rPr>
-                <w:rFonts w:ascii="Times New Roman" w:hAnsi="Times New Roman"/>
-                <w:b/>
-                <w:i w:val="0"/>
-                <w:color w:val="000000"/>
-                <w:sz w:val="20"/>
-              </w:rPr>
-              <w:t>Yashash manzili</w:t>
-            </w:r>
-          </w:p>
-        </w:tc>
-      </w:tr>
-      <w:tr>
-        <w:tc>
-          <w:tcPr>
-            <w:tcW w:type="dxa" w:w="814355"/>
-            <w:shd w:val="clear" w:color="auto" w:fill="FFFFFF"/>
-            <w:tcBorders>
-              <w:top w:val="single" w:sz="4" w:space="0" w:color="000000"/>
-              <w:bottom w:val="single" w:sz="4" w:space="0" w:color="000000"/>
-              <w:left w:val="single" w:sz="4" w:space="0" w:color="000000"/>
-              <w:right w:val="single" w:sz="4" w:space="0" w:color="000000"/>
-            </w:tcBorders>
-          </w:tcPr>
-          <w:p>
-            <w:pPr>
-              <w:jc w:val="center"/>
-              <w:spacing w:before="80" w:after="80"/>
-            </w:pPr>
-            <w:r>
-              <w:rPr>
-                <w:rFonts w:ascii="Times New Roman" w:hAnsi="Times New Roman"/>
-                <w:b w:val="0"/>
-                <w:i w:val="0"/>
-                <w:color w:val="000000"/>
-                <w:sz w:val="20"/>
-              </w:rPr>
-              <w:t>Otasi</w:t>
-            </w:r>
-          </w:p>
-        </w:tc>
-        <w:tc>
-          <w:tcPr>
-            <w:tcW w:type="dxa" w:w="1252855"/>
-            <w:shd w:val="clear" w:color="auto" w:fill="FFFFFF"/>
-            <w:tcBorders>
-              <w:top w:val="single" w:sz="4" w:space="0" w:color="000000"/>
-              <w:bottom w:val="single" w:sz="4" w:space="0" w:color="000000"/>
-              <w:left w:val="single" w:sz="4" w:space="0" w:color="000000"/>
-              <w:right w:val="single" w:sz="4" w:space="0" w:color="000000"/>
-            </w:tcBorders>
-          </w:tcPr>
-          <w:p>
-            <w:pPr>
-              <w:jc w:val="center"/>
-              <w:spacing w:before="80" w:after="80"/>
-            </w:pPr>
-            <w:r>
-              <w:rPr>
-                <w:rFonts w:ascii="Times New Roman" w:hAnsi="Times New Roman"/>
-                <w:b w:val="0"/>
-                <w:i w:val="0"/>
-                <w:color w:val="000000"/>
-                <w:sz w:val="20"/>
-              </w:rPr>
-              <w:t>Palonchiyev G'ishmat</w:t>
-            </w:r>
-          </w:p>
-        </w:tc>
-        <w:tc>
-          <w:tcPr>
-            <w:tcW w:type="dxa" w:w="1064926"/>
-            <w:shd w:val="clear" w:color="auto" w:fill="FFFFFF"/>
-            <w:tcBorders>
-              <w:top w:val="single" w:sz="4" w:space="0" w:color="000000"/>
-              <w:bottom w:val="single" w:sz="4" w:space="0" w:color="000000"/>
-              <w:left w:val="single" w:sz="4" w:space="0" w:color="000000"/>
-              <w:right w:val="single" w:sz="4" w:space="0" w:color="000000"/>
-            </w:tcBorders>
-          </w:tcPr>
-          <w:p>
-            <w:pPr>
-              <w:jc w:val="center"/>
-              <w:spacing w:before="80" w:after="80"/>
-            </w:pPr>
-            <w:r>
-              <w:rPr>
-                <w:rFonts w:ascii="Times New Roman" w:hAnsi="Times New Roman"/>
-                <w:b w:val="0"/>
-                <w:i w:val="0"/>
-                <w:color w:val="000000"/>
-                <w:sz w:val="20"/>
-              </w:rPr>
-              <w:t>1960 yosh</w:t>
-            </w:r>
-          </w:p>
-        </w:tc>
-        <w:tc>
-          <w:tcPr>
-            <w:tcW w:type="dxa" w:w="1753997"/>
-            <w:shd w:val="clear" w:color="auto" w:fill="FFFFFF"/>
-            <w:tcBorders>
-              <w:top w:val="single" w:sz="4" w:space="0" w:color="000000"/>
-              <w:bottom w:val="single" w:sz="4" w:space="0" w:color="000000"/>
-              <w:left w:val="single" w:sz="4" w:space="0" w:color="000000"/>
-              <w:right w:val="single" w:sz="4" w:space="0" w:color="000000"/>
-            </w:tcBorders>
-          </w:tcPr>
-          <w:p>
-            <w:pPr>
-              <w:jc w:val="center"/>
-              <w:spacing w:before="80" w:after="80"/>
-            </w:pPr>
-            <w:r>
-              <w:rPr>
-                <w:rFonts w:ascii="Times New Roman" w:hAnsi="Times New Roman"/>
-                <w:b w:val="0"/>
-                <w:i w:val="0"/>
-                <w:color w:val="000000"/>
-                <w:sz w:val="20"/>
-              </w:rPr>
-              <w:t>Nafaqada</w:t>
-            </w:r>
-          </w:p>
-        </w:tc>
-        <w:tc>
-          <w:tcPr>
-            <w:tcW w:type="dxa" w:w="1378140"/>
-            <w:shd w:val="clear" w:color="auto" w:fill="FFFFFF"/>
-            <w:tcBorders>
-              <w:top w:val="single" w:sz="4" w:space="0" w:color="000000"/>
-              <w:bottom w:val="single" w:sz="4" w:space="0" w:color="000000"/>
-              <w:left w:val="single" w:sz="4" w:space="0" w:color="000000"/>
-              <w:right w:val="single" w:sz="4" w:space="0" w:color="000000"/>
-            </w:tcBorders>
-          </w:tcPr>
-          <w:p>
-            <w:pPr>
-              <w:jc w:val="center"/>
-              <w:spacing w:before="80" w:after="80"/>
-            </w:pPr>
-            <w:r>
-              <w:rPr>
-                <w:rFonts w:ascii="Times New Roman" w:hAnsi="Times New Roman"/>
-                <w:b w:val="0"/>
-                <w:i w:val="0"/>
-                <w:color w:val="000000"/>
-                <w:sz w:val="20"/>
-              </w:rPr>
-              <w:t>Toshkent shahar</w:t>
-            </w:r>
-          </w:p>
-        </w:tc>
-      </w:tr>
-    </w:tbl>
+    <w:p>
+      <w:pPr>
+        <w:jc w:val="center"/>
+      </w:pPr>
+      <w:r>
+        <w:rPr>
+          <w:rFonts w:ascii="Times New Roman" w:hAnsi="Times New Roman"/>
+          <w:b w:val="0"/>
+          <w:i/>
+          <w:color w:val="000000"/>
+          <w:sz w:val="19"/>
+        </w:rPr>
+        <w:t>—</w:t>
+      </w:r>
+    </w:p>
     <w:sectPr>
       <w:pgSz w:w="11906" w:h="16838"/>
       <w:pgMar w:top="1020" w:right="907" w:bottom="1134" w:left="1134" w:header="720" w:footer="720" w:gutter="0"/>

</xml_diff>